<commit_message>
Add smart Form 4 generation and PDF signing
</commit_message>
<xml_diff>
--- a/templates/Form4_Template.docx
+++ b/templates/Form4_Template.docx
@@ -25,13 +25,13 @@
           <w:lang w:val="en-GB" w:eastAsia="zh-CN"/>
         </w:rPr>
         <w:drawing>
-          <wp:anchor distT="0" distB="0" distL="114300" distR="114300" simplePos="0" relativeHeight="251661312" behindDoc="0" locked="0" layoutInCell="1" allowOverlap="1">
+          <wp:anchor distT="0" distB="0" distL="118745" distR="118745" simplePos="0" relativeHeight="251661312" behindDoc="0" locked="0" layoutInCell="1" allowOverlap="1">
             <wp:simplePos x="0" y="0"/>
             <wp:positionH relativeFrom="column">
               <wp:posOffset>5749925</wp:posOffset>
             </wp:positionH>
-            <wp:positionV relativeFrom="paragraph">
-              <wp:posOffset>-574675</wp:posOffset>
+            <wp:positionV relativeFrom="page">
+              <wp:posOffset>625475</wp:posOffset>
             </wp:positionV>
             <wp:extent cx="486410" cy="234950"/>
             <wp:effectExtent l="0" t="0" r="21590" b="19050"/>
@@ -458,13 +458,23 @@
       </w:r>
       <w:r>
         <w:rPr>
+          <w:rFonts w:hint="default" w:ascii="Arial Regular" w:hAnsi="Arial Regular" w:eastAsia="SimSun" w:cs="Arial Regular"/>
+          <w:kern w:val="0"/>
+          <w:sz w:val="22"/>
+          <w:szCs w:val="22"/>
+          <w:lang w:eastAsia="zh-CN" w:bidi="ar"/>
+        </w:rPr>
+        <w:t>{{agreement_date}}</w:t>
+      </w:r>
+      <w:r>
+        <w:rPr>
           <w:rFonts w:ascii="SimSun" w:hAnsi="SimSun" w:eastAsia="SimSun" w:cs="SimSun"/>
           <w:kern w:val="0"/>
           <w:sz w:val="24"/>
           <w:szCs w:val="24"/>
           <w:lang w:val="en-US" w:eastAsia="zh-CN" w:bidi="ar"/>
         </w:rPr>
-        <w:t xml:space="preserve">{{agreement_date}} </w:t>
+        <w:t xml:space="preserve"> </w:t>
       </w:r>
       <w:r>
         <w:rPr>
@@ -499,11 +509,11 @@
       </w:tblPr>
       <w:tblGrid>
         <w:gridCol w:w="1085"/>
-        <w:gridCol w:w="979"/>
-        <w:gridCol w:w="510"/>
-        <w:gridCol w:w="4168"/>
+        <w:gridCol w:w="986"/>
+        <w:gridCol w:w="511"/>
+        <w:gridCol w:w="4174"/>
         <w:gridCol w:w="1684"/>
-        <w:gridCol w:w="1922"/>
+        <w:gridCol w:w="1908"/>
       </w:tblGrid>
       <w:tr>
         <w:trPr>
@@ -568,18 +578,18 @@
                 <w:rFonts w:ascii="Arial" w:hAnsi="Arial" w:cs="Arial"/>
                 <w:sz w:val="22"/>
                 <w:szCs w:val="22"/>
-                <w:lang w:val="en-GB" w:eastAsia="zh-CN"/>
+                <w:lang w:eastAsia="zh-CN"/>
               </w:rPr>
             </w:pPr>
             <w:r>
               <w:rPr>
-                <w:rFonts w:ascii="SimSun" w:hAnsi="SimSun" w:eastAsia="SimSun" w:cs="SimSun"/>
+                <w:rFonts w:hint="default" w:ascii="Arial Regular" w:hAnsi="Arial Regular" w:eastAsia="SimSun" w:cs="Arial Regular"/>
                 <w:kern w:val="0"/>
-                <w:sz w:val="24"/>
-                <w:szCs w:val="24"/>
-                <w:lang w:val="en-US" w:eastAsia="zh-CN" w:bidi="ar"/>
-              </w:rPr>
-              <w:t xml:space="preserve">{{tenant1_name}} </w:t>
+                <w:sz w:val="22"/>
+                <w:szCs w:val="22"/>
+                <w:lang w:eastAsia="zh-CN" w:bidi="ar"/>
+              </w:rPr>
+              <w:t>{{tenant1_name}}</w:t>
             </w:r>
           </w:p>
         </w:tc>
@@ -682,13 +692,23 @@
             </w:pPr>
             <w:r>
               <w:rPr>
+                <w:rFonts w:hint="default" w:ascii="Arial Regular" w:hAnsi="Arial Regular" w:eastAsia="SimSun" w:cs="Arial Regular"/>
+                <w:kern w:val="0"/>
+                <w:sz w:val="22"/>
+                <w:szCs w:val="22"/>
+                <w:lang w:eastAsia="zh-CN" w:bidi="ar"/>
+              </w:rPr>
+              <w:t>{{tenant1_nric}}</w:t>
+            </w:r>
+            <w:r>
+              <w:rPr>
                 <w:rFonts w:ascii="SimSun" w:hAnsi="SimSun" w:eastAsia="SimSun" w:cs="SimSun"/>
                 <w:kern w:val="0"/>
                 <w:sz w:val="24"/>
                 <w:szCs w:val="24"/>
                 <w:lang w:val="en-US" w:eastAsia="zh-CN" w:bidi="ar"/>
               </w:rPr>
-              <w:t xml:space="preserve">{{tenant1_nric}} </w:t>
+              <w:t xml:space="preserve"> </w:t>
             </w:r>
           </w:p>
         </w:tc>
@@ -771,6 +791,16 @@
         </w:tc>
       </w:tr>
       <w:tr>
+        <w:tblPrEx>
+          <w:tblBorders>
+            <w:top w:val="single" w:color="auto" w:sz="4" w:space="0"/>
+            <w:left w:val="single" w:color="auto" w:sz="4" w:space="0"/>
+            <w:bottom w:val="single" w:color="auto" w:sz="4" w:space="0"/>
+            <w:right w:val="single" w:color="auto" w:sz="4" w:space="0"/>
+            <w:insideH w:val="single" w:color="auto" w:sz="4" w:space="0"/>
+            <w:insideV w:val="single" w:color="auto" w:sz="4" w:space="0"/>
+          </w:tblBorders>
+        </w:tblPrEx>
         <w:trPr>
           <w:trHeight w:val="432" w:hRule="atLeast"/>
         </w:trPr>
@@ -833,58 +863,18 @@
                 <w:rFonts w:ascii="Arial" w:hAnsi="Arial" w:cs="Arial"/>
                 <w:sz w:val="22"/>
                 <w:szCs w:val="22"/>
-                <w:lang w:val="en-GB" w:eastAsia="zh-CN"/>
+                <w:lang w:eastAsia="zh-CN"/>
               </w:rPr>
             </w:pPr>
             <w:r>
               <w:rPr>
-                <w:rFonts w:ascii="SimSun" w:hAnsi="SimSun" w:eastAsia="SimSun" w:cs="SimSun"/>
+                <w:rFonts w:hint="default" w:ascii="Arial Regular" w:hAnsi="Arial Regular" w:eastAsia="SimSun" w:cs="Arial Regular"/>
                 <w:kern w:val="0"/>
-                <w:sz w:val="24"/>
-                <w:szCs w:val="24"/>
-                <w:lang w:val="en-US" w:eastAsia="zh-CN" w:bidi="ar"/>
-              </w:rPr>
-              <w:t>{{tenant</w:t>
-            </w:r>
-            <w:r>
-              <w:rPr>
-                <w:rFonts w:ascii="SimSun" w:hAnsi="SimSun" w:eastAsia="SimSun" w:cs="SimSun"/>
-                <w:kern w:val="0"/>
-                <w:sz w:val="24"/>
-                <w:szCs w:val="24"/>
+                <w:sz w:val="22"/>
+                <w:szCs w:val="22"/>
                 <w:lang w:eastAsia="zh-CN" w:bidi="ar"/>
               </w:rPr>
-              <w:t>2</w:t>
-            </w:r>
-            <w:r>
-              <w:rPr>
-                <w:rFonts w:ascii="SimSun" w:hAnsi="SimSun" w:eastAsia="SimSun" w:cs="SimSun"/>
-                <w:kern w:val="0"/>
-                <w:sz w:val="24"/>
-                <w:szCs w:val="24"/>
-                <w:lang w:val="en-US" w:eastAsia="zh-CN" w:bidi="ar"/>
-              </w:rPr>
-              <w:t>_n</w:t>
-            </w:r>
-            <w:r>
-              <w:rPr>
-                <w:rFonts w:ascii="SimSun" w:hAnsi="SimSun" w:eastAsia="SimSun" w:cs="SimSun"/>
-                <w:kern w:val="0"/>
-                <w:sz w:val="24"/>
-                <w:szCs w:val="24"/>
-                <w:lang w:eastAsia="zh-CN" w:bidi="ar"/>
-              </w:rPr>
-              <w:t>ame</w:t>
-            </w:r>
-            <w:r>
-              <w:rPr>
-                <w:rFonts w:ascii="SimSun" w:hAnsi="SimSun" w:eastAsia="SimSun" w:cs="SimSun"/>
-                <w:kern w:val="0"/>
-                <w:sz w:val="24"/>
-                <w:szCs w:val="24"/>
-                <w:lang w:val="en-US" w:eastAsia="zh-CN" w:bidi="ar"/>
-              </w:rPr>
-              <w:t xml:space="preserve">}} </w:t>
+              <w:t>{{tenant2_name}}</w:t>
             </w:r>
           </w:p>
         </w:tc>
@@ -928,16 +918,7 @@
                 <w:szCs w:val="22"/>
                 <w:lang w:eastAsia="zh-CN"/>
               </w:rPr>
-              <w:t>/</w:t>
-            </w:r>
-            <w:r>
-              <w:rPr>
-                <w:rFonts w:ascii="Arial" w:hAnsi="Arial" w:cs="Arial"/>
-                <w:sz w:val="22"/>
-                <w:szCs w:val="22"/>
-                <w:lang w:eastAsia="zh-CN"/>
-              </w:rPr>
-              <w:t>Passport</w:t>
+              <w:t>/Passport</w:t>
             </w:r>
             <w:r>
               <w:rPr>
@@ -996,38 +977,38 @@
             </w:pPr>
             <w:r>
               <w:rPr>
+                <w:rFonts w:hint="default" w:ascii="Arial Regular" w:hAnsi="Arial Regular" w:eastAsia="SimSun" w:cs="Arial Regular"/>
+                <w:kern w:val="0"/>
+                <w:sz w:val="22"/>
+                <w:szCs w:val="22"/>
+                <w:lang w:eastAsia="zh-CN" w:bidi="ar"/>
+              </w:rPr>
+              <w:t>{{tenant2_nric}}</w:t>
+            </w:r>
+            <w:r>
+              <w:rPr>
                 <w:rFonts w:ascii="SimSun" w:hAnsi="SimSun" w:eastAsia="SimSun" w:cs="SimSun"/>
                 <w:kern w:val="0"/>
                 <w:sz w:val="24"/>
                 <w:szCs w:val="24"/>
                 <w:lang w:val="en-US" w:eastAsia="zh-CN" w:bidi="ar"/>
               </w:rPr>
-              <w:t>{{tenant</w:t>
-            </w:r>
-            <w:r>
-              <w:rPr>
-                <w:rFonts w:ascii="SimSun" w:hAnsi="SimSun" w:eastAsia="SimSun" w:cs="SimSun"/>
-                <w:kern w:val="0"/>
-                <w:sz w:val="24"/>
-                <w:szCs w:val="24"/>
-                <w:lang w:eastAsia="zh-CN" w:bidi="ar"/>
-              </w:rPr>
-              <w:t>2</w:t>
-            </w:r>
-            <w:r>
-              <w:rPr>
-                <w:rFonts w:ascii="SimSun" w:hAnsi="SimSun" w:eastAsia="SimSun" w:cs="SimSun"/>
-                <w:kern w:val="0"/>
-                <w:sz w:val="24"/>
-                <w:szCs w:val="24"/>
-                <w:lang w:val="en-US" w:eastAsia="zh-CN" w:bidi="ar"/>
-              </w:rPr>
-              <w:t xml:space="preserve">_nric}} </w:t>
+              <w:t xml:space="preserve"> </w:t>
             </w:r>
           </w:p>
         </w:tc>
       </w:tr>
       <w:tr>
+        <w:tblPrEx>
+          <w:tblBorders>
+            <w:top w:val="single" w:color="auto" w:sz="4" w:space="0"/>
+            <w:left w:val="single" w:color="auto" w:sz="4" w:space="0"/>
+            <w:bottom w:val="single" w:color="auto" w:sz="4" w:space="0"/>
+            <w:right w:val="single" w:color="auto" w:sz="4" w:space="0"/>
+            <w:insideH w:val="single" w:color="auto" w:sz="4" w:space="0"/>
+            <w:insideV w:val="single" w:color="auto" w:sz="4" w:space="0"/>
+          </w:tblBorders>
+        </w:tblPrEx>
         <w:trPr>
           <w:trHeight w:val="432" w:hRule="atLeast"/>
         </w:trPr>
@@ -1095,6 +1076,16 @@
         </w:tc>
       </w:tr>
       <w:tr>
+        <w:tblPrEx>
+          <w:tblBorders>
+            <w:top w:val="single" w:color="auto" w:sz="4" w:space="0"/>
+            <w:left w:val="single" w:color="auto" w:sz="4" w:space="0"/>
+            <w:bottom w:val="single" w:color="auto" w:sz="4" w:space="0"/>
+            <w:right w:val="single" w:color="auto" w:sz="4" w:space="0"/>
+            <w:insideH w:val="single" w:color="auto" w:sz="4" w:space="0"/>
+            <w:insideV w:val="single" w:color="auto" w:sz="4" w:space="0"/>
+          </w:tblBorders>
+        </w:tblPrEx>
         <w:trPr>
           <w:trHeight w:val="432" w:hRule="atLeast"/>
         </w:trPr>
@@ -1157,58 +1148,18 @@
                 <w:rFonts w:ascii="Arial" w:hAnsi="Arial" w:eastAsia="MS Mincho" w:cs="Arial"/>
                 <w:sz w:val="22"/>
                 <w:szCs w:val="22"/>
-                <w:lang w:val="en-GB" w:eastAsia="zh-CN" w:bidi="ar-SA"/>
+                <w:lang w:eastAsia="zh-CN" w:bidi="ar-SA"/>
               </w:rPr>
             </w:pPr>
             <w:r>
               <w:rPr>
-                <w:rFonts w:ascii="SimSun" w:hAnsi="SimSun" w:eastAsia="SimSun" w:cs="SimSun"/>
+                <w:rFonts w:hint="default" w:ascii="Arial Regular" w:hAnsi="Arial Regular" w:eastAsia="SimSun" w:cs="Arial Regular"/>
                 <w:kern w:val="0"/>
-                <w:sz w:val="24"/>
-                <w:szCs w:val="24"/>
-                <w:lang w:val="en-US" w:eastAsia="zh-CN" w:bidi="ar"/>
-              </w:rPr>
-              <w:t>{{tenant</w:t>
-            </w:r>
-            <w:r>
-              <w:rPr>
-                <w:rFonts w:ascii="SimSun" w:hAnsi="SimSun" w:eastAsia="SimSun" w:cs="SimSun"/>
-                <w:kern w:val="0"/>
-                <w:sz w:val="24"/>
-                <w:szCs w:val="24"/>
+                <w:sz w:val="22"/>
+                <w:szCs w:val="22"/>
                 <w:lang w:eastAsia="zh-CN" w:bidi="ar"/>
               </w:rPr>
-              <w:t>3</w:t>
-            </w:r>
-            <w:r>
-              <w:rPr>
-                <w:rFonts w:ascii="SimSun" w:hAnsi="SimSun" w:eastAsia="SimSun" w:cs="SimSun"/>
-                <w:kern w:val="0"/>
-                <w:sz w:val="24"/>
-                <w:szCs w:val="24"/>
-                <w:lang w:val="en-US" w:eastAsia="zh-CN" w:bidi="ar"/>
-              </w:rPr>
-              <w:t>_n</w:t>
-            </w:r>
-            <w:r>
-              <w:rPr>
-                <w:rFonts w:ascii="SimSun" w:hAnsi="SimSun" w:eastAsia="SimSun" w:cs="SimSun"/>
-                <w:kern w:val="0"/>
-                <w:sz w:val="24"/>
-                <w:szCs w:val="24"/>
-                <w:lang w:eastAsia="zh-CN" w:bidi="ar"/>
-              </w:rPr>
-              <w:t>ame</w:t>
-            </w:r>
-            <w:r>
-              <w:rPr>
-                <w:rFonts w:ascii="SimSun" w:hAnsi="SimSun" w:eastAsia="SimSun" w:cs="SimSun"/>
-                <w:kern w:val="0"/>
-                <w:sz w:val="24"/>
-                <w:szCs w:val="24"/>
-                <w:lang w:val="en-US" w:eastAsia="zh-CN" w:bidi="ar"/>
-              </w:rPr>
-              <w:t xml:space="preserve">}} </w:t>
+              <w:t>{{tenant3_name}}</w:t>
             </w:r>
           </w:p>
         </w:tc>
@@ -1252,16 +1203,7 @@
                 <w:szCs w:val="22"/>
                 <w:lang w:eastAsia="zh-CN"/>
               </w:rPr>
-              <w:t>/</w:t>
-            </w:r>
-            <w:r>
-              <w:rPr>
-                <w:rFonts w:ascii="Arial" w:hAnsi="Arial" w:cs="Arial"/>
-                <w:sz w:val="22"/>
-                <w:szCs w:val="22"/>
-                <w:lang w:eastAsia="zh-CN"/>
-              </w:rPr>
-              <w:t>Passport</w:t>
+              <w:t>/Passport</w:t>
             </w:r>
             <w:r>
               <w:rPr>
@@ -1320,38 +1262,38 @@
             </w:pPr>
             <w:r>
               <w:rPr>
+                <w:rFonts w:hint="default" w:ascii="Arial Regular" w:hAnsi="Arial Regular" w:eastAsia="SimSun" w:cs="Arial Regular"/>
+                <w:kern w:val="0"/>
+                <w:sz w:val="22"/>
+                <w:szCs w:val="22"/>
+                <w:lang w:eastAsia="zh-CN" w:bidi="ar"/>
+              </w:rPr>
+              <w:t>{{tenant3_nric}}</w:t>
+            </w:r>
+            <w:r>
+              <w:rPr>
                 <w:rFonts w:ascii="SimSun" w:hAnsi="SimSun" w:eastAsia="SimSun" w:cs="SimSun"/>
                 <w:kern w:val="0"/>
                 <w:sz w:val="24"/>
                 <w:szCs w:val="24"/>
                 <w:lang w:val="en-US" w:eastAsia="zh-CN" w:bidi="ar"/>
               </w:rPr>
-              <w:t>{{tenant</w:t>
-            </w:r>
-            <w:r>
-              <w:rPr>
-                <w:rFonts w:ascii="SimSun" w:hAnsi="SimSun" w:eastAsia="SimSun" w:cs="SimSun"/>
-                <w:kern w:val="0"/>
-                <w:sz w:val="24"/>
-                <w:szCs w:val="24"/>
-                <w:lang w:eastAsia="zh-CN" w:bidi="ar"/>
-              </w:rPr>
-              <w:t>3</w:t>
-            </w:r>
-            <w:r>
-              <w:rPr>
-                <w:rFonts w:ascii="SimSun" w:hAnsi="SimSun" w:eastAsia="SimSun" w:cs="SimSun"/>
-                <w:kern w:val="0"/>
-                <w:sz w:val="24"/>
-                <w:szCs w:val="24"/>
-                <w:lang w:val="en-US" w:eastAsia="zh-CN" w:bidi="ar"/>
-              </w:rPr>
-              <w:t xml:space="preserve">_nric}} </w:t>
+              <w:t xml:space="preserve"> </w:t>
             </w:r>
           </w:p>
         </w:tc>
       </w:tr>
       <w:tr>
+        <w:tblPrEx>
+          <w:tblBorders>
+            <w:top w:val="single" w:color="auto" w:sz="4" w:space="0"/>
+            <w:left w:val="single" w:color="auto" w:sz="4" w:space="0"/>
+            <w:bottom w:val="single" w:color="auto" w:sz="4" w:space="0"/>
+            <w:right w:val="single" w:color="auto" w:sz="4" w:space="0"/>
+            <w:insideH w:val="single" w:color="auto" w:sz="4" w:space="0"/>
+            <w:insideV w:val="single" w:color="auto" w:sz="4" w:space="0"/>
+          </w:tblBorders>
+        </w:tblPrEx>
         <w:trPr>
           <w:trHeight w:val="432" w:hRule="atLeast"/>
         </w:trPr>
@@ -1419,6 +1361,16 @@
         </w:tc>
       </w:tr>
       <w:tr>
+        <w:tblPrEx>
+          <w:tblBorders>
+            <w:top w:val="single" w:color="auto" w:sz="4" w:space="0"/>
+            <w:left w:val="single" w:color="auto" w:sz="4" w:space="0"/>
+            <w:bottom w:val="single" w:color="auto" w:sz="4" w:space="0"/>
+            <w:right w:val="single" w:color="auto" w:sz="4" w:space="0"/>
+            <w:insideH w:val="single" w:color="auto" w:sz="4" w:space="0"/>
+            <w:insideV w:val="single" w:color="auto" w:sz="4" w:space="0"/>
+          </w:tblBorders>
+        </w:tblPrEx>
         <w:trPr>
           <w:trHeight w:val="432" w:hRule="atLeast"/>
         </w:trPr>
@@ -1481,58 +1433,18 @@
                 <w:rFonts w:ascii="Arial" w:hAnsi="Arial" w:eastAsia="MS Mincho" w:cs="Arial"/>
                 <w:sz w:val="22"/>
                 <w:szCs w:val="22"/>
-                <w:lang w:val="en-GB" w:eastAsia="zh-CN" w:bidi="ar-SA"/>
+                <w:lang w:eastAsia="zh-CN" w:bidi="ar-SA"/>
               </w:rPr>
             </w:pPr>
             <w:r>
               <w:rPr>
-                <w:rFonts w:ascii="SimSun" w:hAnsi="SimSun" w:eastAsia="SimSun" w:cs="SimSun"/>
+                <w:rFonts w:hint="default" w:ascii="Arial Regular" w:hAnsi="Arial Regular" w:eastAsia="SimSun" w:cs="Arial Regular"/>
                 <w:kern w:val="0"/>
-                <w:sz w:val="24"/>
-                <w:szCs w:val="24"/>
-                <w:lang w:val="en-US" w:eastAsia="zh-CN" w:bidi="ar"/>
-              </w:rPr>
-              <w:t>{{tenant</w:t>
-            </w:r>
-            <w:r>
-              <w:rPr>
-                <w:rFonts w:ascii="SimSun" w:hAnsi="SimSun" w:eastAsia="SimSun" w:cs="SimSun"/>
-                <w:kern w:val="0"/>
-                <w:sz w:val="24"/>
-                <w:szCs w:val="24"/>
+                <w:sz w:val="22"/>
+                <w:szCs w:val="22"/>
                 <w:lang w:eastAsia="zh-CN" w:bidi="ar"/>
               </w:rPr>
-              <w:t>4</w:t>
-            </w:r>
-            <w:r>
-              <w:rPr>
-                <w:rFonts w:ascii="SimSun" w:hAnsi="SimSun" w:eastAsia="SimSun" w:cs="SimSun"/>
-                <w:kern w:val="0"/>
-                <w:sz w:val="24"/>
-                <w:szCs w:val="24"/>
-                <w:lang w:val="en-US" w:eastAsia="zh-CN" w:bidi="ar"/>
-              </w:rPr>
-              <w:t>_n</w:t>
-            </w:r>
-            <w:r>
-              <w:rPr>
-                <w:rFonts w:ascii="SimSun" w:hAnsi="SimSun" w:eastAsia="SimSun" w:cs="SimSun"/>
-                <w:kern w:val="0"/>
-                <w:sz w:val="24"/>
-                <w:szCs w:val="24"/>
-                <w:lang w:eastAsia="zh-CN" w:bidi="ar"/>
-              </w:rPr>
-              <w:t>ame</w:t>
-            </w:r>
-            <w:r>
-              <w:rPr>
-                <w:rFonts w:ascii="SimSun" w:hAnsi="SimSun" w:eastAsia="SimSun" w:cs="SimSun"/>
-                <w:kern w:val="0"/>
-                <w:sz w:val="24"/>
-                <w:szCs w:val="24"/>
-                <w:lang w:val="en-US" w:eastAsia="zh-CN" w:bidi="ar"/>
-              </w:rPr>
-              <w:t xml:space="preserve">}} </w:t>
+              <w:t>{{tenant4_name}}</w:t>
             </w:r>
           </w:p>
         </w:tc>
@@ -1576,16 +1488,7 @@
                 <w:szCs w:val="22"/>
                 <w:lang w:eastAsia="zh-CN"/>
               </w:rPr>
-              <w:t>/</w:t>
-            </w:r>
-            <w:r>
-              <w:rPr>
-                <w:rFonts w:ascii="Arial" w:hAnsi="Arial" w:cs="Arial"/>
-                <w:sz w:val="22"/>
-                <w:szCs w:val="22"/>
-                <w:lang w:eastAsia="zh-CN"/>
-              </w:rPr>
-              <w:t>Passport</w:t>
+              <w:t>/Passport</w:t>
             </w:r>
             <w:r>
               <w:rPr>
@@ -1639,43 +1542,33 @@
                 <w:rFonts w:ascii="Arial" w:hAnsi="Arial" w:eastAsia="MS Mincho" w:cs="Arial"/>
                 <w:sz w:val="22"/>
                 <w:szCs w:val="22"/>
-                <w:lang w:val="en-GB" w:eastAsia="zh-CN" w:bidi="ar-SA"/>
+                <w:lang w:eastAsia="zh-CN" w:bidi="ar-SA"/>
               </w:rPr>
             </w:pPr>
             <w:r>
               <w:rPr>
-                <w:rFonts w:ascii="SimSun" w:hAnsi="SimSun" w:eastAsia="SimSun" w:cs="SimSun"/>
+                <w:rFonts w:hint="default" w:ascii="Arial Regular" w:hAnsi="Arial Regular" w:eastAsia="SimSun" w:cs="Arial Regular"/>
                 <w:kern w:val="0"/>
-                <w:sz w:val="24"/>
-                <w:szCs w:val="24"/>
-                <w:lang w:val="en-US" w:eastAsia="zh-CN" w:bidi="ar"/>
-              </w:rPr>
-              <w:t>{{tenant</w:t>
-            </w:r>
-            <w:r>
-              <w:rPr>
-                <w:rFonts w:ascii="SimSun" w:hAnsi="SimSun" w:eastAsia="SimSun" w:cs="SimSun"/>
-                <w:kern w:val="0"/>
-                <w:sz w:val="24"/>
-                <w:szCs w:val="24"/>
+                <w:sz w:val="22"/>
+                <w:szCs w:val="22"/>
                 <w:lang w:eastAsia="zh-CN" w:bidi="ar"/>
               </w:rPr>
-              <w:t>4</w:t>
-            </w:r>
-            <w:r>
-              <w:rPr>
-                <w:rFonts w:ascii="SimSun" w:hAnsi="SimSun" w:eastAsia="SimSun" w:cs="SimSun"/>
-                <w:kern w:val="0"/>
-                <w:sz w:val="24"/>
-                <w:szCs w:val="24"/>
-                <w:lang w:val="en-US" w:eastAsia="zh-CN" w:bidi="ar"/>
-              </w:rPr>
-              <w:t xml:space="preserve">_nric}} </w:t>
+              <w:t>{{tenant4_nric}}</w:t>
             </w:r>
           </w:p>
         </w:tc>
       </w:tr>
       <w:tr>
+        <w:tblPrEx>
+          <w:tblBorders>
+            <w:top w:val="single" w:color="auto" w:sz="4" w:space="0"/>
+            <w:left w:val="single" w:color="auto" w:sz="4" w:space="0"/>
+            <w:bottom w:val="single" w:color="auto" w:sz="4" w:space="0"/>
+            <w:right w:val="single" w:color="auto" w:sz="4" w:space="0"/>
+            <w:insideH w:val="single" w:color="auto" w:sz="4" w:space="0"/>
+            <w:insideV w:val="single" w:color="auto" w:sz="4" w:space="0"/>
+          </w:tblBorders>
+        </w:tblPrEx>
         <w:trPr>
           <w:trHeight w:val="432" w:hRule="atLeast"/>
         </w:trPr>
@@ -1743,6 +1636,16 @@
         </w:tc>
       </w:tr>
       <w:tr>
+        <w:tblPrEx>
+          <w:tblBorders>
+            <w:top w:val="single" w:color="auto" w:sz="4" w:space="0"/>
+            <w:left w:val="single" w:color="auto" w:sz="4" w:space="0"/>
+            <w:bottom w:val="single" w:color="auto" w:sz="4" w:space="0"/>
+            <w:right w:val="single" w:color="auto" w:sz="4" w:space="0"/>
+            <w:insideH w:val="single" w:color="auto" w:sz="4" w:space="0"/>
+            <w:insideV w:val="single" w:color="auto" w:sz="4" w:space="0"/>
+          </w:tblBorders>
+        </w:tblPrEx>
         <w:trPr>
           <w:trHeight w:val="432" w:hRule="atLeast"/>
         </w:trPr>
@@ -1907,6 +1810,16 @@
         </w:tc>
       </w:tr>
       <w:tr>
+        <w:tblPrEx>
+          <w:tblBorders>
+            <w:top w:val="single" w:color="auto" w:sz="4" w:space="0"/>
+            <w:left w:val="single" w:color="auto" w:sz="4" w:space="0"/>
+            <w:bottom w:val="single" w:color="auto" w:sz="4" w:space="0"/>
+            <w:right w:val="single" w:color="auto" w:sz="4" w:space="0"/>
+            <w:insideH w:val="single" w:color="auto" w:sz="4" w:space="0"/>
+            <w:insideV w:val="single" w:color="auto" w:sz="4" w:space="0"/>
+          </w:tblBorders>
+        </w:tblPrEx>
         <w:trPr>
           <w:trHeight w:val="432" w:hRule="atLeast"/>
         </w:trPr>
@@ -2121,35 +2034,13 @@
       </w:r>
       <w:r>
         <w:rPr>
-          <w:rFonts w:ascii="SimSun" w:hAnsi="SimSun" w:eastAsia="SimSun" w:cs="SimSun"/>
+          <w:rFonts w:hint="default" w:ascii="Arial Regular" w:hAnsi="Arial Regular" w:eastAsia="SimSun" w:cs="Arial Regular"/>
           <w:kern w:val="0"/>
-          <w:sz w:val="24"/>
-          <w:szCs w:val="24"/>
-          <w:lang w:val="en-US" w:eastAsia="zh-CN" w:bidi="ar"/>
-        </w:rPr>
-        <w:t>{{</w:t>
-      </w:r>
-      <w:r>
-        <w:rPr>
-          <w:rFonts w:ascii="SimSun" w:hAnsi="SimSun" w:eastAsia="SimSun" w:cs="SimSun"/>
-          <w:kern w:val="0"/>
-          <w:sz w:val="24"/>
-          <w:szCs w:val="24"/>
+          <w:sz w:val="22"/>
+          <w:szCs w:val="22"/>
           <w:lang w:eastAsia="zh-CN" w:bidi="ar"/>
         </w:rPr>
-        <w:t>property</w:t>
-      </w:r>
-      <w:bookmarkStart w:id="3" w:name="_GoBack"/>
-      <w:bookmarkEnd w:id="3"/>
-      <w:r>
-        <w:rPr>
-          <w:rFonts w:ascii="SimSun" w:hAnsi="SimSun" w:eastAsia="SimSun" w:cs="SimSun"/>
-          <w:kern w:val="0"/>
-          <w:sz w:val="24"/>
-          <w:szCs w:val="24"/>
-          <w:lang w:val="en-US" w:eastAsia="zh-CN" w:bidi="ar"/>
-        </w:rPr>
-        <w:t>_address}}</w:t>
+        <w:t>{{property_address}}</w:t>
       </w:r>
       <w:r>
         <w:rPr>
@@ -2191,13 +2082,13 @@
           <w:lang w:val="en-GB" w:eastAsia="zh-CN"/>
         </w:rPr>
         <w:drawing>
-          <wp:anchor distT="0" distB="0" distL="114300" distR="114300" simplePos="0" relativeHeight="251659264" behindDoc="0" locked="0" layoutInCell="1" allowOverlap="1">
+          <wp:anchor distT="0" distB="0" distL="118745" distR="118745" simplePos="0" relativeHeight="251659264" behindDoc="0" locked="0" layoutInCell="1" allowOverlap="1">
             <wp:simplePos x="0" y="0"/>
             <wp:positionH relativeFrom="column">
               <wp:posOffset>5751830</wp:posOffset>
             </wp:positionH>
-            <wp:positionV relativeFrom="paragraph">
-              <wp:posOffset>-568325</wp:posOffset>
+            <wp:positionV relativeFrom="page">
+              <wp:posOffset>631825</wp:posOffset>
             </wp:positionV>
             <wp:extent cx="486410" cy="234950"/>
             <wp:effectExtent l="0" t="0" r="21590" b="19050"/>
@@ -2392,13 +2283,13 @@
       </w:r>
       <w:r>
         <w:rPr>
-          <w:rFonts w:ascii="SimSun" w:hAnsi="SimSun" w:eastAsia="SimSun" w:cs="SimSun"/>
+          <w:rFonts w:hint="default" w:ascii="Arial Regular" w:hAnsi="Arial Regular" w:eastAsia="SimSun" w:cs="Arial Regular"/>
           <w:kern w:val="0"/>
-          <w:sz w:val="24"/>
-          <w:szCs w:val="24"/>
-          <w:lang w:val="en-US" w:eastAsia="zh-CN" w:bidi="ar"/>
-        </w:rPr>
-        <w:t>{{</w:t>
+          <w:sz w:val="22"/>
+          <w:szCs w:val="22"/>
+          <w:lang w:eastAsia="zh-CN" w:bidi="ar"/>
+        </w:rPr>
+        <w:t>{{lease_term}}</w:t>
       </w:r>
       <w:r>
         <w:rPr>
@@ -2408,17 +2299,63 @@
           <w:szCs w:val="24"/>
           <w:lang w:eastAsia="zh-CN" w:bidi="ar"/>
         </w:rPr>
-        <w:t>lease</w:t>
-      </w:r>
-      <w:r>
-        <w:rPr>
-          <w:rFonts w:ascii="SimSun" w:hAnsi="SimSun" w:eastAsia="SimSun" w:cs="SimSun"/>
+        <w:t xml:space="preserve"> </w:t>
+      </w:r>
+      <w:r>
+        <w:rPr>
+          <w:rFonts w:ascii="Arial" w:hAnsi="Arial" w:cs="Arial"/>
+          <w:sz w:val="22"/>
+          <w:szCs w:val="22"/>
+          <w:lang w:eastAsia="zh-CN"/>
+        </w:rPr>
+        <w:t xml:space="preserve">months </w:t>
+      </w:r>
+      <w:r>
+        <w:rPr>
+          <w:rFonts w:ascii="Arial" w:hAnsi="Arial" w:cs="Arial"/>
+          <w:sz w:val="22"/>
+          <w:szCs w:val="22"/>
+          <w:lang w:val="en-GB" w:eastAsia="zh-CN"/>
+        </w:rPr>
+        <w:t xml:space="preserve"> </w:t>
+      </w:r>
+      <w:r>
+        <w:rPr>
+          <w:rFonts w:ascii="Arial" w:hAnsi="Arial" w:cs="Arial"/>
+          <w:sz w:val="22"/>
+          <w:szCs w:val="22"/>
+          <w:vertAlign w:val="superscript"/>
+          <w:lang w:val="en-GB" w:eastAsia="zh-CN"/>
+        </w:rPr>
+        <w:t>(9)</w:t>
+      </w:r>
+      <w:r>
+        <w:rPr>
+          <w:rFonts w:ascii="Arial" w:hAnsi="Arial" w:cs="Arial"/>
+          <w:sz w:val="22"/>
+          <w:szCs w:val="22"/>
+          <w:lang w:val="en-GB" w:eastAsia="zh-CN"/>
+        </w:rPr>
+        <w:t>, the Tenant shall pay the Estate Agent commission of *S$</w:t>
+      </w:r>
+      <w:r>
+        <w:rPr>
+          <w:rFonts w:ascii="Arial" w:hAnsi="Arial" w:cs="Arial"/>
+          <w:sz w:val="22"/>
+          <w:szCs w:val="22"/>
+          <w:lang w:eastAsia="zh-CN"/>
+        </w:rPr>
+        <w:t xml:space="preserve"> </w:t>
+      </w:r>
+      <w:r>
+        <w:rPr>
+          <w:rFonts w:hint="default" w:ascii="Arial Regular" w:hAnsi="Arial Regular" w:eastAsia="SimSun" w:cs="Arial Regular"/>
           <w:kern w:val="0"/>
-          <w:sz w:val="24"/>
-          <w:szCs w:val="24"/>
-          <w:lang w:val="en-US" w:eastAsia="zh-CN" w:bidi="ar"/>
-        </w:rPr>
-        <w:t>_</w:t>
+          <w:sz w:val="22"/>
+          <w:szCs w:val="22"/>
+          <w:lang w:eastAsia="zh-CN" w:bidi="ar"/>
+        </w:rPr>
+        <w:t>{{commission_term}}</w:t>
       </w:r>
       <w:r>
         <w:rPr>
@@ -2428,26 +2365,6 @@
           <w:szCs w:val="24"/>
           <w:lang w:eastAsia="zh-CN" w:bidi="ar"/>
         </w:rPr>
-        <w:t>term</w:t>
-      </w:r>
-      <w:r>
-        <w:rPr>
-          <w:rFonts w:ascii="SimSun" w:hAnsi="SimSun" w:eastAsia="SimSun" w:cs="SimSun"/>
-          <w:kern w:val="0"/>
-          <w:sz w:val="24"/>
-          <w:szCs w:val="24"/>
-          <w:lang w:val="en-US" w:eastAsia="zh-CN" w:bidi="ar"/>
-        </w:rPr>
-        <w:t>}}</w:t>
-      </w:r>
-      <w:r>
-        <w:rPr>
-          <w:rFonts w:ascii="SimSun" w:hAnsi="SimSun" w:eastAsia="SimSun" w:cs="SimSun"/>
-          <w:kern w:val="0"/>
-          <w:sz w:val="24"/>
-          <w:szCs w:val="24"/>
-          <w:lang w:eastAsia="zh-CN" w:bidi="ar"/>
-        </w:rPr>
         <w:t xml:space="preserve"> </w:t>
       </w:r>
       <w:r>
@@ -2457,149 +2374,7 @@
           <w:szCs w:val="22"/>
           <w:lang w:eastAsia="zh-CN"/>
         </w:rPr>
-        <w:t>months</w:t>
-      </w:r>
-      <w:r>
-        <w:rPr>
-          <w:rFonts w:ascii="Arial" w:hAnsi="Arial" w:cs="Arial"/>
-          <w:sz w:val="22"/>
-          <w:szCs w:val="22"/>
-          <w:lang w:eastAsia="zh-CN"/>
-        </w:rPr>
-        <w:t xml:space="preserve"> </w:t>
-      </w:r>
-      <w:r>
-        <w:rPr>
-          <w:rFonts w:ascii="Arial" w:hAnsi="Arial" w:cs="Arial"/>
-          <w:sz w:val="22"/>
-          <w:szCs w:val="22"/>
-          <w:lang w:val="en-GB" w:eastAsia="zh-CN"/>
-        </w:rPr>
-        <w:t xml:space="preserve"> </w:t>
-      </w:r>
-      <w:r>
-        <w:rPr>
-          <w:rFonts w:ascii="Arial" w:hAnsi="Arial" w:cs="Arial"/>
-          <w:sz w:val="22"/>
-          <w:szCs w:val="22"/>
-          <w:vertAlign w:val="superscript"/>
-          <w:lang w:val="en-GB" w:eastAsia="zh-CN"/>
-        </w:rPr>
-        <w:t>(9)</w:t>
-      </w:r>
-      <w:r>
-        <w:rPr>
-          <w:rFonts w:ascii="Arial" w:hAnsi="Arial" w:cs="Arial"/>
-          <w:sz w:val="22"/>
-          <w:szCs w:val="22"/>
-          <w:lang w:val="en-GB" w:eastAsia="zh-CN"/>
-        </w:rPr>
-        <w:t>, the Tenant shall pay the Estate Agent commission of *S$</w:t>
-      </w:r>
-      <w:r>
-        <w:rPr>
-          <w:rFonts w:ascii="Arial" w:hAnsi="Arial" w:cs="Arial"/>
-          <w:sz w:val="22"/>
-          <w:szCs w:val="22"/>
-          <w:lang w:eastAsia="zh-CN"/>
-        </w:rPr>
-        <w:t xml:space="preserve"> </w:t>
-      </w:r>
-      <w:r>
-        <w:rPr>
-          <w:rFonts w:ascii="SimSun" w:hAnsi="SimSun" w:eastAsia="SimSun" w:cs="SimSun"/>
-          <w:kern w:val="0"/>
-          <w:sz w:val="24"/>
-          <w:szCs w:val="24"/>
-          <w:lang w:val="en-US" w:eastAsia="zh-CN" w:bidi="ar"/>
-        </w:rPr>
-        <w:t>{{</w:t>
-      </w:r>
-      <w:r>
-        <w:rPr>
-          <w:rFonts w:ascii="SimSun" w:hAnsi="SimSun" w:eastAsia="SimSun" w:cs="SimSun"/>
-          <w:kern w:val="0"/>
-          <w:sz w:val="24"/>
-          <w:szCs w:val="24"/>
-          <w:lang w:eastAsia="zh-CN" w:bidi="ar"/>
-        </w:rPr>
-        <w:t>commission</w:t>
-      </w:r>
-      <w:r>
-        <w:rPr>
-          <w:rFonts w:ascii="SimSun" w:hAnsi="SimSun" w:eastAsia="SimSun" w:cs="SimSun"/>
-          <w:kern w:val="0"/>
-          <w:sz w:val="24"/>
-          <w:szCs w:val="24"/>
-          <w:lang w:val="en-US" w:eastAsia="zh-CN" w:bidi="ar"/>
-        </w:rPr>
-        <w:t>_</w:t>
-      </w:r>
-      <w:r>
-        <w:rPr>
-          <w:rFonts w:ascii="SimSun" w:hAnsi="SimSun" w:eastAsia="SimSun" w:cs="SimSun"/>
-          <w:kern w:val="0"/>
-          <w:sz w:val="24"/>
-          <w:szCs w:val="24"/>
-          <w:lang w:eastAsia="zh-CN" w:bidi="ar"/>
-        </w:rPr>
-        <w:t>term</w:t>
-      </w:r>
-      <w:r>
-        <w:rPr>
-          <w:rFonts w:ascii="SimSun" w:hAnsi="SimSun" w:eastAsia="SimSun" w:cs="SimSun"/>
-          <w:kern w:val="0"/>
-          <w:sz w:val="24"/>
-          <w:szCs w:val="24"/>
-          <w:lang w:val="en-US" w:eastAsia="zh-CN" w:bidi="ar"/>
-        </w:rPr>
-        <w:t>}}</w:t>
-      </w:r>
-      <w:r>
-        <w:rPr>
-          <w:rFonts w:ascii="SimSun" w:hAnsi="SimSun" w:eastAsia="SimSun" w:cs="SimSun"/>
-          <w:kern w:val="0"/>
-          <w:sz w:val="24"/>
-          <w:szCs w:val="24"/>
-          <w:lang w:eastAsia="zh-CN" w:bidi="ar"/>
-        </w:rPr>
-        <w:t xml:space="preserve"> </w:t>
-      </w:r>
-      <w:r>
-        <w:rPr>
-          <w:rFonts w:ascii="Arial" w:hAnsi="Arial" w:cs="Arial"/>
-          <w:sz w:val="22"/>
-          <w:szCs w:val="22"/>
-          <w:lang w:eastAsia="zh-CN"/>
-        </w:rPr>
-        <w:t>month</w:t>
-      </w:r>
-      <w:r>
-        <w:rPr>
-          <w:rFonts w:ascii="Arial" w:hAnsi="Arial" w:cs="Arial"/>
-          <w:sz w:val="22"/>
-          <w:szCs w:val="22"/>
-          <w:lang w:eastAsia="zh-CN"/>
-        </w:rPr>
-        <w:t>(</w:t>
-      </w:r>
-      <w:r>
-        <w:rPr>
-          <w:rFonts w:ascii="Arial" w:hAnsi="Arial" w:cs="Arial"/>
-          <w:sz w:val="22"/>
-          <w:szCs w:val="22"/>
-          <w:lang w:eastAsia="zh-CN"/>
-        </w:rPr>
-        <w:t>s</w:t>
-      </w:r>
-      <w:r>
-        <w:rPr>
-          <w:rFonts w:ascii="Arial" w:hAnsi="Arial" w:cs="Arial"/>
-          <w:sz w:val="22"/>
-          <w:szCs w:val="22"/>
-          <w:lang w:eastAsia="zh-CN"/>
-        </w:rPr>
-        <w:t>)</w:t>
+        <w:t>month(s)</w:t>
       </w:r>
       <w:r>
         <w:rPr>
@@ -2997,47 +2772,14 @@
       </w:r>
       <w:r>
         <w:rPr>
-          <w:rFonts w:ascii="SimSun" w:hAnsi="SimSun" w:eastAsia="SimSun" w:cs="SimSun"/>
+          <w:rFonts w:hint="default" w:ascii="Arial Regular" w:hAnsi="Arial Regular" w:eastAsia="SimSun" w:cs="Arial Regular"/>
           <w:kern w:val="0"/>
-          <w:sz w:val="24"/>
-          <w:szCs w:val="24"/>
-          <w:u w:val="none"/>
-          <w:lang w:val="en-US" w:eastAsia="zh-CN" w:bidi="ar"/>
-        </w:rPr>
-        <w:t>{{</w:t>
-      </w:r>
-      <w:r>
-        <w:rPr>
-          <w:rFonts w:ascii="SimSun" w:hAnsi="SimSun" w:eastAsia="SimSun" w:cs="SimSun"/>
-          <w:kern w:val="0"/>
-          <w:sz w:val="24"/>
-          <w:szCs w:val="24"/>
+          <w:sz w:val="22"/>
+          <w:szCs w:val="22"/>
           <w:u w:val="none"/>
           <w:lang w:eastAsia="zh-CN" w:bidi="ar"/>
         </w:rPr>
-        <w:t>renew_</w:t>
-      </w:r>
-      <w:r>
-        <w:rPr>
-          <w:rFonts w:ascii="SimSun" w:hAnsi="SimSun" w:eastAsia="SimSun" w:cs="SimSun"/>
-          <w:kern w:val="0"/>
-          <w:sz w:val="24"/>
-          <w:szCs w:val="24"/>
-          <w:u w:val="none"/>
-          <w:lang w:eastAsia="zh-CN" w:bidi="ar"/>
-        </w:rPr>
-        <w:t>commission</w:t>
-      </w:r>
-      <w:r>
-        <w:rPr>
-          <w:rFonts w:ascii="SimSun" w:hAnsi="SimSun" w:eastAsia="SimSun" w:cs="SimSun"/>
-          <w:kern w:val="0"/>
-          <w:sz w:val="24"/>
-          <w:szCs w:val="24"/>
-          <w:u w:val="none"/>
-          <w:lang w:val="en-US" w:eastAsia="zh-CN" w:bidi="ar"/>
-        </w:rPr>
-        <w:t>}}</w:t>
+        <w:t>{{renew_commission}}</w:t>
       </w:r>
       <w:r>
         <w:rPr>
@@ -3258,13 +3000,13 @@
           <w:lang w:val="en-GB" w:eastAsia="zh-CN"/>
         </w:rPr>
         <w:drawing>
-          <wp:anchor distT="0" distB="0" distL="114300" distR="114300" simplePos="0" relativeHeight="251663360" behindDoc="0" locked="0" layoutInCell="1" allowOverlap="1">
+          <wp:anchor distT="0" distB="0" distL="118745" distR="118745" simplePos="0" relativeHeight="251663360" behindDoc="0" locked="0" layoutInCell="1" allowOverlap="1">
             <wp:simplePos x="0" y="0"/>
             <wp:positionH relativeFrom="column">
               <wp:posOffset>5815965</wp:posOffset>
             </wp:positionH>
-            <wp:positionV relativeFrom="paragraph">
-              <wp:posOffset>-600710</wp:posOffset>
+            <wp:positionV relativeFrom="page">
+              <wp:posOffset>599440</wp:posOffset>
             </wp:positionV>
             <wp:extent cx="486410" cy="234950"/>
             <wp:effectExtent l="0" t="0" r="21590" b="19050"/>
@@ -3778,6 +3520,7 @@
     <w:p>
       <w:pPr>
         <w:numPr>
+          <w:ilvl w:val="0"/>
           <w:numId w:val="0"/>
         </w:numPr>
         <w:autoSpaceDE w:val="0"/>
@@ -3824,13 +3567,13 @@
           <w:lang w:val="en-GB" w:eastAsia="zh-CN"/>
         </w:rPr>
         <w:drawing>
-          <wp:anchor distT="0" distB="0" distL="114300" distR="114300" simplePos="0" relativeHeight="251669504" behindDoc="0" locked="0" layoutInCell="1" allowOverlap="1">
+          <wp:anchor distT="0" distB="0" distL="118745" distR="118745" simplePos="0" relativeHeight="251669504" behindDoc="0" locked="0" layoutInCell="1" allowOverlap="1">
             <wp:simplePos x="0" y="0"/>
             <wp:positionH relativeFrom="column">
               <wp:posOffset>5768340</wp:posOffset>
             </wp:positionH>
-            <wp:positionV relativeFrom="paragraph">
-              <wp:posOffset>-589915</wp:posOffset>
+            <wp:positionV relativeFrom="page">
+              <wp:posOffset>610235</wp:posOffset>
             </wp:positionV>
             <wp:extent cx="486410" cy="234950"/>
             <wp:effectExtent l="0" t="0" r="21590" b="19050"/>
@@ -4158,7 +3901,7 @@
           </mc:Choice>
           <mc:Fallback>
             <w:pict>
-              <v:group id="Group 30" o:spid="_x0000_s1026" o:spt="203" style="position:absolute;left:0pt;margin-left:440.75pt;margin-top:30.9pt;height:50.4pt;width:65pt;z-index:251658240;mso-width-relative:page;mso-height-relative:page;" coordorigin="9064,8467" coordsize="1300,1008" o:gfxdata="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">
+              <v:group id="Group 30" o:spid="_x0000_s1026" o:spt="203" style="position:absolute;left:0pt;margin-left:440.75pt;margin-top:30.9pt;height:50.4pt;width:65pt;z-index:251658240;mso-width-relative:page;mso-height-relative:page;" coordorigin="9064,8467" coordsize="1300,1008" o:gfxdata="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">
                 <o:lock v:ext="edit" aspectratio="f"/>
                 <v:group id="Group 31" o:spid="_x0000_s1026" o:spt="203" style="position:absolute;left:9064;top:8467;height:1008;width:1300;" coordorigin="9064,8467" coordsize="1300,1008" o:gfxdata="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">
                   <o:lock v:ext="edit" aspectratio="f"/>
@@ -4251,69 +3994,14 @@
       </w:pPr>
       <w:r>
         <w:rPr>
-          <w:rFonts w:ascii="SimSun" w:hAnsi="SimSun" w:eastAsia="SimSun" w:cs="SimSun"/>
+          <w:rFonts w:hint="default" w:ascii="Arial Regular" w:hAnsi="Arial Regular" w:eastAsia="SimSun" w:cs="Arial Regular"/>
           <w:kern w:val="0"/>
-          <w:sz w:val="24"/>
-          <w:szCs w:val="24"/>
-          <w:lang w:val="en-US" w:eastAsia="zh-CN" w:bidi="ar"/>
-        </w:rPr>
-        <w:t>{{</w:t>
-      </w:r>
-      <w:r>
-        <w:rPr>
-          <w:rFonts w:ascii="SimSun" w:hAnsi="SimSun" w:eastAsia="SimSun" w:cs="SimSun"/>
-          <w:kern w:val="0"/>
-          <w:sz w:val="24"/>
-          <w:szCs w:val="24"/>
+          <w:sz w:val="22"/>
+          <w:szCs w:val="22"/>
           <w:lang w:eastAsia="zh-CN" w:bidi="ar"/>
         </w:rPr>
-        <w:t>additional</w:t>
-      </w:r>
-      <w:r>
-        <w:rPr>
-          <w:rFonts w:ascii="SimSun" w:hAnsi="SimSun" w:eastAsia="SimSun" w:cs="SimSun"/>
-          <w:kern w:val="0"/>
-          <w:sz w:val="24"/>
-          <w:szCs w:val="24"/>
-          <w:lang w:val="en-US" w:eastAsia="zh-CN" w:bidi="ar"/>
-        </w:rPr>
-        <w:t>_</w:t>
-      </w:r>
-      <w:r>
-        <w:rPr>
-          <w:rFonts w:ascii="SimSun" w:hAnsi="SimSun" w:eastAsia="SimSun" w:cs="SimSun"/>
-          <w:kern w:val="0"/>
-          <w:sz w:val="24"/>
-          <w:szCs w:val="24"/>
-          <w:lang w:eastAsia="zh-CN" w:bidi="ar"/>
-        </w:rPr>
-        <w:t>term</w:t>
-      </w:r>
-      <w:r>
-        <w:rPr>
-          <w:rFonts w:ascii="SimSun" w:hAnsi="SimSun" w:eastAsia="SimSun" w:cs="SimSun"/>
-          <w:kern w:val="0"/>
-          <w:sz w:val="24"/>
-          <w:szCs w:val="24"/>
-          <w:lang w:val="en-US" w:eastAsia="zh-CN" w:bidi="ar"/>
-        </w:rPr>
-        <w:t>}}</w:t>
-      </w:r>
-    </w:p>
-    <w:p>
-      <w:pPr>
-        <w:autoSpaceDE w:val="0"/>
-        <w:autoSpaceDN w:val="0"/>
-        <w:adjustRightInd w:val="0"/>
-        <w:spacing w:before="120" w:after="120" w:line="360" w:lineRule="auto"/>
-        <w:jc w:val="both"/>
-        <w:rPr>
-          <w:rFonts w:ascii="Arial" w:hAnsi="Arial" w:cs="Arial"/>
-          <w:sz w:val="22"/>
-          <w:szCs w:val="22"/>
-          <w:lang w:val="en-GB" w:eastAsia="zh-CN"/>
-        </w:rPr>
-      </w:pPr>
+        <w:t>{{additional_term}}</w:t>
+      </w:r>
       <w:r>
         <w:rPr>
           <w:rFonts w:ascii="Arial" w:hAnsi="Arial" w:cs="Arial"/>
@@ -4344,13 +4032,13 @@
           <w:lang w:val="en-GB" w:eastAsia="zh-CN"/>
         </w:rPr>
         <w:drawing>
-          <wp:anchor distT="0" distB="0" distL="114300" distR="114300" simplePos="0" relativeHeight="251681792" behindDoc="0" locked="0" layoutInCell="1" allowOverlap="1">
+          <wp:anchor distT="0" distB="0" distL="118745" distR="118745" simplePos="0" relativeHeight="251681792" behindDoc="0" locked="0" layoutInCell="1" allowOverlap="1">
             <wp:simplePos x="0" y="0"/>
             <wp:positionH relativeFrom="column">
               <wp:posOffset>5787390</wp:posOffset>
             </wp:positionH>
-            <wp:positionV relativeFrom="paragraph">
-              <wp:posOffset>-586105</wp:posOffset>
+            <wp:positionV relativeFrom="page">
+              <wp:posOffset>614045</wp:posOffset>
             </wp:positionV>
             <wp:extent cx="486410" cy="234950"/>
             <wp:effectExtent l="0" t="0" r="21590" b="19050"/>
@@ -4751,13 +4439,13 @@
             </w:r>
             <w:r>
               <w:rPr>
-                <w:rFonts w:ascii="SimSun" w:hAnsi="SimSun" w:eastAsia="SimSun" w:cs="SimSun"/>
+                <w:rFonts w:hint="default" w:ascii="Arial Regular" w:hAnsi="Arial Regular" w:eastAsia="SimSun" w:cs="Arial Regular"/>
                 <w:kern w:val="0"/>
-                <w:sz w:val="24"/>
-                <w:szCs w:val="24"/>
-                <w:lang w:val="en-US" w:eastAsia="zh-CN" w:bidi="ar"/>
-              </w:rPr>
-              <w:t xml:space="preserve">{{agreement_date}} </w:t>
+                <w:sz w:val="22"/>
+                <w:szCs w:val="22"/>
+                <w:lang w:eastAsia="zh-CN" w:bidi="ar"/>
+              </w:rPr>
+              <w:t>{{agreement_date}}</w:t>
             </w:r>
           </w:p>
         </w:tc>
@@ -5189,13 +4877,13 @@
             </w:r>
             <w:r>
               <w:rPr>
-                <w:rFonts w:ascii="SimSun" w:hAnsi="SimSun" w:eastAsia="SimSun" w:cs="SimSun"/>
+                <w:rFonts w:hint="default" w:ascii="Arial Regular" w:hAnsi="Arial Regular" w:eastAsia="SimSun" w:cs="Arial Regular"/>
                 <w:kern w:val="0"/>
-                <w:sz w:val="24"/>
-                <w:szCs w:val="24"/>
-                <w:lang w:val="en-US" w:eastAsia="zh-CN" w:bidi="ar"/>
-              </w:rPr>
-              <w:t xml:space="preserve">{{agreement_date}} </w:t>
+                <w:sz w:val="22"/>
+                <w:szCs w:val="22"/>
+                <w:lang w:eastAsia="zh-CN" w:bidi="ar"/>
+              </w:rPr>
+              <w:t>{{agreement_date}}</w:t>
             </w:r>
           </w:p>
         </w:tc>
@@ -5623,13 +5311,13 @@
             </w:r>
             <w:r>
               <w:rPr>
-                <w:rFonts w:ascii="SimSun" w:hAnsi="SimSun" w:eastAsia="SimSun" w:cs="SimSun"/>
+                <w:rFonts w:hint="default" w:ascii="Arial Regular" w:hAnsi="Arial Regular" w:eastAsia="SimSun" w:cs="Arial Regular"/>
                 <w:kern w:val="0"/>
-                <w:sz w:val="24"/>
-                <w:szCs w:val="24"/>
-                <w:lang w:val="en-US" w:eastAsia="zh-CN" w:bidi="ar"/>
-              </w:rPr>
-              <w:t xml:space="preserve">{{agreement_date}} </w:t>
+                <w:sz w:val="22"/>
+                <w:szCs w:val="22"/>
+                <w:lang w:eastAsia="zh-CN" w:bidi="ar"/>
+              </w:rPr>
+              <w:t>{{agreement_date}}</w:t>
             </w:r>
           </w:p>
         </w:tc>
@@ -6061,13 +5749,13 @@
             </w:r>
             <w:r>
               <w:rPr>
-                <w:rFonts w:ascii="SimSun" w:hAnsi="SimSun" w:eastAsia="SimSun" w:cs="SimSun"/>
+                <w:rFonts w:hint="default" w:ascii="Arial Regular" w:hAnsi="Arial Regular" w:eastAsia="SimSun" w:cs="Arial Regular"/>
                 <w:kern w:val="0"/>
-                <w:sz w:val="24"/>
-                <w:szCs w:val="24"/>
-                <w:lang w:val="en-US" w:eastAsia="zh-CN" w:bidi="ar"/>
-              </w:rPr>
-              <w:t xml:space="preserve">{{agreement_date}} </w:t>
+                <w:sz w:val="22"/>
+                <w:szCs w:val="22"/>
+                <w:lang w:eastAsia="zh-CN" w:bidi="ar"/>
+              </w:rPr>
+              <w:t>{{agreement_date}}</w:t>
             </w:r>
           </w:p>
         </w:tc>
@@ -6191,13 +5879,13 @@
                 <w:lang w:val="en-GB" w:eastAsia="zh-CN"/>
               </w:rPr>
               <w:drawing>
-                <wp:anchor distT="0" distB="0" distL="114300" distR="114300" simplePos="0" relativeHeight="251756544" behindDoc="0" locked="0" layoutInCell="1" allowOverlap="1">
+                <wp:anchor distT="0" distB="0" distL="118745" distR="118745" simplePos="0" relativeHeight="251756544" behindDoc="0" locked="0" layoutInCell="1" allowOverlap="1">
                   <wp:simplePos x="0" y="0"/>
                   <wp:positionH relativeFrom="column">
                     <wp:posOffset>1674495</wp:posOffset>
                   </wp:positionH>
-                  <wp:positionV relativeFrom="paragraph">
-                    <wp:posOffset>19685</wp:posOffset>
+                  <wp:positionV relativeFrom="page">
+                    <wp:posOffset>26035</wp:posOffset>
                   </wp:positionV>
                   <wp:extent cx="1119505" cy="428625"/>
                   <wp:effectExtent l="0" t="0" r="23495" b="3175"/>
@@ -6615,16 +6303,7 @@
           <w:szCs w:val="22"/>
           <w:lang w:eastAsia="zh-CN"/>
         </w:rPr>
-        <w:t xml:space="preserve"> </w:t>
-      </w:r>
-      <w:r>
-        <w:rPr>
-          <w:rFonts w:ascii="Arial" w:hAnsi="Arial" w:cs="Arial"/>
-          <w:sz w:val="22"/>
-          <w:szCs w:val="22"/>
-          <w:lang w:eastAsia="zh-CN"/>
-        </w:rPr>
-        <w:t>R0741148C</w:t>
+        <w:t xml:space="preserve"> R0741148C</w:t>
       </w:r>
     </w:p>
     <w:p>
@@ -6780,6 +6459,8 @@
           <w:lang w:val="en-GB" w:eastAsia="zh-CN"/>
         </w:rPr>
       </w:pPr>
+      <w:bookmarkStart w:id="3" w:name="_GoBack"/>
+      <w:bookmarkEnd w:id="3"/>
       <w:r>
         <w:rPr>
           <w:rFonts w:cs="TimesTen-Bold"/>
@@ -6806,8 +6487,8 @@
             <wp:positionH relativeFrom="column">
               <wp:posOffset>5770245</wp:posOffset>
             </wp:positionH>
-            <wp:positionV relativeFrom="paragraph">
-              <wp:posOffset>-594360</wp:posOffset>
+            <wp:positionV relativeFrom="page">
+              <wp:posOffset>605790</wp:posOffset>
             </wp:positionV>
             <wp:extent cx="486410" cy="234950"/>
             <wp:effectExtent l="0" t="0" r="21590" b="19050"/>
@@ -7566,8 +7247,8 @@
             <wp:positionH relativeFrom="column">
               <wp:posOffset>5788660</wp:posOffset>
             </wp:positionH>
-            <wp:positionV relativeFrom="paragraph">
-              <wp:posOffset>-604520</wp:posOffset>
+            <wp:positionV relativeFrom="page">
+              <wp:posOffset>595630</wp:posOffset>
             </wp:positionV>
             <wp:extent cx="486410" cy="234950"/>
             <wp:effectExtent l="0" t="0" r="21590" b="19050"/>
@@ -9985,7 +9666,7 @@
     <w:lsdException w:qFormat="1" w:unhideWhenUsed="0" w:uiPriority="0" w:semiHidden="0" w:name="Title"/>
     <w:lsdException w:uiPriority="99" w:name="Closing"/>
     <w:lsdException w:uiPriority="99" w:name="Signature"/>
-    <w:lsdException w:qFormat="1" w:uiPriority="1" w:name="Default Paragraph Font"/>
+    <w:lsdException w:qFormat="1" w:uiPriority="1" w:semiHidden="0" w:name="Default Paragraph Font"/>
     <w:lsdException w:qFormat="1" w:unhideWhenUsed="0" w:uiPriority="0" w:name="Body Text"/>
     <w:lsdException w:uiPriority="99" w:name="Body Text Indent"/>
     <w:lsdException w:uiPriority="99" w:name="List Continue"/>
@@ -10023,7 +9704,7 @@
     <w:lsdException w:uiPriority="99" w:name="HTML Sample"/>
     <w:lsdException w:uiPriority="99" w:name="HTML Typewriter"/>
     <w:lsdException w:uiPriority="99" w:name="HTML Variable"/>
-    <w:lsdException w:qFormat="1" w:uiPriority="99" w:name="Normal Table"/>
+    <w:lsdException w:qFormat="1" w:uiPriority="99" w:semiHidden="0" w:name="Normal Table"/>
     <w:lsdException w:uiPriority="99" w:name="annotation subject"/>
     <w:lsdException w:uiPriority="99" w:name="Table Simple 1"/>
     <w:lsdException w:uiPriority="99" w:name="Table Simple 2"/>

</xml_diff>